<commit_message>
Add LaTeX solution doc; fill live URL + Team Spectres across submission docs
- submission/ParkPulse.tex: full solution write-up in LaTeX (Overleaf-ready),
  title block with Team Spectres (Kavya Mahajan, Aarav Harshvardhan, Souhardyo
  Dasgupta, Vishesh Gupta) and the live demo URL.
- Filled https://flipkart-gridlock-gamma.vercel.app/ into SOLUTION/SUBMISSION/
  VIDEO_SCRIPT, added the team to SOLUTION/SUBMISSION/PITCH_DECK, and
  regenerated the three .docx.

Co-Authored-By: Claude Opus 4.8 <noreply@anthropic.com>
Claude-Session: https://claude.ai/code/session_015xqbLKu3bgv91jhV9ZLyyM
</commit_message>
<xml_diff>
--- a/submission/ParkPulse_Pitch_Deck.docx
+++ b/submission/ParkPulse_Pitch_Deck.docx
@@ -70,6 +70,16 @@
     <w:p>
       <w:r>
         <w:t>Find the parking that actually chokes traffic, and patrol it first.</w:t>
+      </w:r>
+    </w:p>
+    <w:p>
+      <w:r>
+        <w:t>Team Spectres · Kavya Mahajan, Aarav Harshvardhan, Souhardyo Dasgupta, Vishesh Gupta</w:t>
+      </w:r>
+    </w:p>
+    <w:p>
+      <w:r>
+        <w:t>Demo: https://flipkart-gridlock-gamma.vercel.app/</w:t>
       </w:r>
     </w:p>
     <w:p>

</xml_diff>